<commit_message>
docs: consolidate recent AI terminal roles
Co-authored-by: lianglei666 <779158033@qq.com>
</commit_message>
<xml_diff>
--- a/resume/梁磊-Android端侧AI-AIOS架构师.docx
+++ b/resume/梁磊-Android端侧AI-AIOS架构师.docx
@@ -302,7 +302,7 @@
           <w:color w:val="232323"/>
           <w:sz w:val="21"/>
         </w:rPr>
-        <w:t>深圳市一曌科技有限公司（追觅手机）｜手机 BU</w:t>
+        <w:t>端侧 AI 与智能终端研发阶段｜2025.02—至今</w:t>
       </w:r>
     </w:p>
     <w:p>
@@ -316,7 +316,21 @@
           <w:color w:val="232323"/>
           <w:sz w:val="19"/>
         </w:rPr>
-        <w:t>Android AI 架构师｜2026.04—至今</w:t>
+        <w:t>任职单位（倒序）：深圳市一曌科技有限公司·追觅手机（2026.04—至今）｜美团无人车业务部（2025.09—2026.04）｜追觅科技·星空汽车（2025.02—2025.08）</w:t>
+      </w:r>
+    </w:p>
+    <w:p>
+      <w:pPr>
+        <w:spacing w:before="0" w:after="40" w:line="252" w:lineRule="auto"/>
+      </w:pPr>
+      <w:r>
+        <w:rPr>
+          <w:rFonts w:ascii="Aptos" w:hAnsi="Aptos" w:eastAsia="微软雅黑"/>
+          <w:b/>
+          <w:color w:val="232323"/>
+          <w:sz w:val="19"/>
+        </w:rPr>
+        <w:t>手机 AIOS｜Android AI 架构师</w:t>
       </w:r>
     </w:p>
     <w:p>
@@ -332,7 +346,7 @@
           <w:color w:val="232323"/>
           <w:sz w:val="19"/>
         </w:rPr>
-        <w:t>主导手机 AIOS 端侧 Agent 系统架构规划与核心模块落地，设计“全局编排层 + 本地执行层”双 Agent 分层架构，打通意图规划、任务分发、异步执行、状态回调和流式反馈完整链路。</w:t>
+        <w:t>主导手机 AIOS 端侧 Agent 架构及核心模块落地，设计“全局编排层 + 本地执行层”双 Agent 体系，打通意图规划、任务分发、异步执行、状态回调和流式反馈链路。</w:t>
       </w:r>
     </w:p>
     <w:p>
@@ -348,7 +362,7 @@
           <w:color w:val="232323"/>
           <w:sz w:val="19"/>
         </w:rPr>
-        <w:t>设计双向 MCP Bridge，将跨层 HTTP/SSE 通信封装为标准 MCP JSON-RPC 接口，提供规划创建、任务提交、状态查询及进度回调等标准工具，降低 Agent 与终端能力的接入成本。</w:t>
+        <w:t>设计双向 MCP Bridge，将 HTTP/SSE 通信封装为标准 MCP JSON-RPC 接口；建设多 Agent 调度和技能体系，支持 6 类垂直 Agent 及 15+ 可复用技能。</w:t>
       </w:r>
     </w:p>
     <w:p>
@@ -364,7 +378,7 @@
           <w:color w:val="232323"/>
           <w:sz w:val="19"/>
         </w:rPr>
-        <w:t>建设多 Agent 并行调度体系，支持全局编排、私人助理、内容创作等 6 类垂直 Agent，并沉淀 15+ 可复用技能工作流。</w:t>
+        <w:t>牵头 Android 自动化执行插件研发，封装屏幕读取、点击、截屏、应用拉起等 38 项设备能力，实现脱离 ADB 与 PC 的端内 UI 感知及操作。</w:t>
       </w:r>
     </w:p>
     <w:p>
@@ -380,7 +394,21 @@
           <w:color w:val="232323"/>
           <w:sz w:val="19"/>
         </w:rPr>
-        <w:t>牵头 Android 自动化执行插件研发，封装屏幕读取、点击、截屏、应用拉起等 38 项设备能力；通过 WebSocket、中继服务和无障碍服务实现脱离 ADB 与 PC 的端内 UI 感知及操作。</w:t>
+        <w:t>搭建 ARM64 离线部署管线及四层本地记忆体系，完成端侧轻量模型、RAG、端云混合推理与 A2UI 的系统集成。</w:t>
+      </w:r>
+    </w:p>
+    <w:p>
+      <w:pPr>
+        <w:spacing w:before="0" w:after="40" w:line="252" w:lineRule="auto"/>
+      </w:pPr>
+      <w:r>
+        <w:rPr>
+          <w:rFonts w:ascii="Aptos" w:hAnsi="Aptos" w:eastAsia="微软雅黑"/>
+          <w:b/>
+          <w:color w:val="232323"/>
+          <w:sz w:val="19"/>
+        </w:rPr>
+        <w:t>美团无人车｜Android 资深研发工程师 L7</w:t>
       </w:r>
     </w:p>
     <w:p>
@@ -396,7 +424,7 @@
           <w:color w:val="232323"/>
           <w:sz w:val="19"/>
         </w:rPr>
-        <w:t>搭建离线优先部署管线，定制 ARM64 沙箱 APK，内置 Agent 运行环境和自动部署器，实现首次启动初始化、配置同步及基于 PID 的服务生命周期管理。</w:t>
+        <w:t>负责 H24、S20、S26 无人车车内机及云坐席的 360 环视、3D 高精地图和车辆控制；承担 S26 去地平线 J3 项目的算法迁移、GPU 渲染及 Android 开发，按年产 1 万辆测算，预计降低硬件成本约 4,000 万元。</w:t>
       </w:r>
     </w:p>
     <w:p>
@@ -412,7 +440,7 @@
           <w:color w:val="232323"/>
           <w:sz w:val="19"/>
         </w:rPr>
-        <w:t>设计瞬时、工作、长期、技能四层本地记忆体系，结合结构化存储、关键词检索和统一路由，为离线任务规划及个性化执行提供上下文支持。</w:t>
+        <w:t>主导车机与云坐席离线 AI 助手落地，完成轻量模型适配、量化、车载私有 RAG 及弱网/断网运行。</w:t>
       </w:r>
     </w:p>
     <w:p>
@@ -428,21 +456,7 @@
           <w:color w:val="232323"/>
           <w:sz w:val="19"/>
         </w:rPr>
-        <w:t>完成端侧轻量模型、端云混合推理与 A2UI 生成式界面的系统集成，形成从自然语言意图到终端任务执行的完整闭环。</w:t>
-      </w:r>
-    </w:p>
-    <w:p>
-      <w:pPr>
-        <w:spacing w:before="100" w:after="20" w:line="252" w:lineRule="auto"/>
-      </w:pPr>
-      <w:r>
-        <w:rPr>
-          <w:rFonts w:ascii="Aptos" w:hAnsi="Aptos" w:eastAsia="微软雅黑"/>
-          <w:b/>
-          <w:color w:val="232323"/>
-          <w:sz w:val="21"/>
-        </w:rPr>
-        <w:t>北京三快科技有限公司（美团）｜无人车业务部</w:t>
+        <w:t>开发车辆控制 Agent，连接车机信号、底盘控制和环视模块；接入多模态视觉能力并探索 A2UI 生成式交互。</w:t>
       </w:r>
     </w:p>
     <w:p>
@@ -456,7 +470,7 @@
           <w:color w:val="232323"/>
           <w:sz w:val="19"/>
         </w:rPr>
-        <w:t>Android 资深研发工程师 L7｜2025.09—2026.04</w:t>
+        <w:t>星空汽车｜Android 专家开发工程师</w:t>
       </w:r>
     </w:p>
     <w:p>
@@ -472,7 +486,7 @@
           <w:color w:val="232323"/>
           <w:sz w:val="19"/>
         </w:rPr>
-        <w:t>负责 H24、S20、S26 无人车车内机及云坐席研发，覆盖 360 环视、3D 高精地图、车辆控制等核心功能。</w:t>
+        <w:t>负责娱乐、车控车设、AI 与 3D 应用的架构设计、技术选型和性能优化，统一多应用基础框架与公共组件。</w:t>
       </w:r>
     </w:p>
     <w:p>
@@ -488,163 +502,7 @@
           <w:color w:val="232323"/>
           <w:sz w:val="19"/>
         </w:rPr>
-        <w:t>承担 S26 车型去地平线 J3 芯片项目中的算法迁移、OpenGL 渲染与 Android 应用开发，将相关能力迁移至云坐席 GPU 侧；按年产 1 万辆测算，预计降低硬件成本约 4,000 万元。</w:t>
-      </w:r>
-    </w:p>
-    <w:p>
-      <w:pPr>
-        <w:pStyle w:val="ListBullet"/>
-        <w:spacing w:before="0" w:after="30" w:line="252" w:lineRule="auto"/>
-        <w:ind w:left="255" w:hanging="113"/>
-      </w:pPr>
-      <w:r>
-        <w:rPr>
-          <w:rFonts w:ascii="Aptos" w:hAnsi="Aptos" w:eastAsia="微软雅黑"/>
-          <w:b w:val="0"/>
-          <w:color w:val="232323"/>
-          <w:sz w:val="19"/>
-        </w:rPr>
-        <w:t>主导车机与云坐席离线 AI 助手工程落地，完成轻量模型适配、量化及端侧运行，使车辆知识问答和基础助手能力在弱网、断网环境下可用。</w:t>
-      </w:r>
-    </w:p>
-    <w:p>
-      <w:pPr>
-        <w:pStyle w:val="ListBullet"/>
-        <w:spacing w:before="0" w:after="30" w:line="252" w:lineRule="auto"/>
-        <w:ind w:left="255" w:hanging="113"/>
-      </w:pPr>
-      <w:r>
-        <w:rPr>
-          <w:rFonts w:ascii="Aptos" w:hAnsi="Aptos" w:eastAsia="微软雅黑"/>
-          <w:b w:val="0"/>
-          <w:color w:val="232323"/>
-          <w:sz w:val="19"/>
-        </w:rPr>
-        <w:t>建设车载私有 RAG 系统，导入车辆说明书、故障手册、园区规范等知识，提供本地问答和故障排查能力。</w:t>
-      </w:r>
-    </w:p>
-    <w:p>
-      <w:pPr>
-        <w:pStyle w:val="ListBullet"/>
-        <w:spacing w:before="0" w:after="30" w:line="252" w:lineRule="auto"/>
-        <w:ind w:left="255" w:hanging="113"/>
-      </w:pPr>
-      <w:r>
-        <w:rPr>
-          <w:rFonts w:ascii="Aptos" w:hAnsi="Aptos" w:eastAsia="微软雅黑"/>
-          <w:b w:val="0"/>
-          <w:color w:val="232323"/>
-          <w:sz w:val="19"/>
-        </w:rPr>
-        <w:t>开发车辆控制 Agent，接入车机信号、底盘控制及环视模块，支持通过自然语言控制车灯、雨刮、泊车和环视画面等车辆能力。</w:t>
-      </w:r>
-    </w:p>
-    <w:p>
-      <w:pPr>
-        <w:pStyle w:val="ListBullet"/>
-        <w:spacing w:before="0" w:after="30" w:line="252" w:lineRule="auto"/>
-        <w:ind w:left="255" w:hanging="113"/>
-      </w:pPr>
-      <w:r>
-        <w:rPr>
-          <w:rFonts w:ascii="Aptos" w:hAnsi="Aptos" w:eastAsia="微软雅黑"/>
-          <w:b w:val="0"/>
-          <w:color w:val="232323"/>
-          <w:sz w:val="19"/>
-        </w:rPr>
-        <w:t>接入多模态视觉能力，处理 360 环视画面中的障碍物、车位和行人信息，并探索基于 A2UI 的生成式交互界面。</w:t>
-      </w:r>
-    </w:p>
-    <w:p>
-      <w:pPr>
-        <w:spacing w:before="100" w:after="20" w:line="252" w:lineRule="auto"/>
-      </w:pPr>
-      <w:r>
-        <w:rPr>
-          <w:rFonts w:ascii="Aptos" w:hAnsi="Aptos" w:eastAsia="微软雅黑"/>
-          <w:b/>
-          <w:color w:val="232323"/>
-          <w:sz w:val="21"/>
-        </w:rPr>
-        <w:t>追觅科技（星空汽车）</w:t>
-      </w:r>
-    </w:p>
-    <w:p>
-      <w:pPr>
-        <w:spacing w:before="0" w:after="40" w:line="252" w:lineRule="auto"/>
-      </w:pPr>
-      <w:r>
-        <w:rPr>
-          <w:rFonts w:ascii="Aptos" w:hAnsi="Aptos" w:eastAsia="微软雅黑"/>
-          <w:b/>
-          <w:color w:val="232323"/>
-          <w:sz w:val="19"/>
-        </w:rPr>
-        <w:t>Android 专家开发工程师｜2025.02—2025.08</w:t>
-      </w:r>
-    </w:p>
-    <w:p>
-      <w:pPr>
-        <w:pStyle w:val="ListBullet"/>
-        <w:spacing w:before="0" w:after="30" w:line="252" w:lineRule="auto"/>
-        <w:ind w:left="255" w:hanging="113"/>
-      </w:pPr>
-      <w:r>
-        <w:rPr>
-          <w:rFonts w:ascii="Aptos" w:hAnsi="Aptos" w:eastAsia="微软雅黑"/>
-          <w:b w:val="0"/>
-          <w:color w:val="232323"/>
-          <w:sz w:val="19"/>
-        </w:rPr>
-        <w:t>负责娱乐、车控车设、AI 及 3D 应用的架构设计、技术选型和性能优化，统一多应用基础框架与公共组件。</w:t>
-      </w:r>
-    </w:p>
-    <w:p>
-      <w:pPr>
-        <w:pStyle w:val="ListBullet"/>
-        <w:spacing w:before="0" w:after="30" w:line="252" w:lineRule="auto"/>
-        <w:ind w:left="255" w:hanging="113"/>
-      </w:pPr>
-      <w:r>
-        <w:rPr>
-          <w:rFonts w:ascii="Aptos" w:hAnsi="Aptos" w:eastAsia="微软雅黑"/>
-          <w:b w:val="0"/>
-          <w:color w:val="232323"/>
-          <w:sz w:val="19"/>
-        </w:rPr>
-        <w:t>建设座舱创新能力，包括 OpenGL 2D/3D 引擎、AR HUD 渲染、AI 应用、应用安全及 DDS Native 车辆信号 SDK。</w:t>
-      </w:r>
-    </w:p>
-    <w:p>
-      <w:pPr>
-        <w:pStyle w:val="ListBullet"/>
-        <w:spacing w:before="0" w:after="30" w:line="252" w:lineRule="auto"/>
-        <w:ind w:left="255" w:hanging="113"/>
-      </w:pPr>
-      <w:r>
-        <w:rPr>
-          <w:rFonts w:ascii="Aptos" w:hAnsi="Aptos" w:eastAsia="微软雅黑"/>
-          <w:b w:val="0"/>
-          <w:color w:val="232323"/>
-          <w:sz w:val="19"/>
-        </w:rPr>
-        <w:t>牵头 APA、SR 地图、360 环视、DDS Native SDK 和 AI 应用等项目，推进 Android、Native、图形与车辆信号能力集成。</w:t>
-      </w:r>
-    </w:p>
-    <w:p>
-      <w:pPr>
-        <w:pStyle w:val="ListBullet"/>
-        <w:spacing w:before="0" w:after="30" w:line="252" w:lineRule="auto"/>
-        <w:ind w:left="255" w:hanging="113"/>
-      </w:pPr>
-      <w:r>
-        <w:rPr>
-          <w:rFonts w:ascii="Aptos" w:hAnsi="Aptos" w:eastAsia="微软雅黑"/>
-          <w:b w:val="0"/>
-          <w:color w:val="232323"/>
-          <w:sz w:val="19"/>
-        </w:rPr>
-        <w:t>探索车内情绪感知、乘员看护及智驾环境感知等多模态 AI 场景，完成开源方案预研与工程架构设计。</w:t>
+        <w:t>建设 OpenGL 2D/3D、AR HUD、AI 应用和 DDS Native 信号 SDK，牵头 APA、SR 地图、360 环视及多模态 AI 场景预研落地。</w:t>
       </w:r>
     </w:p>
     <w:p>

</xml_diff>